<commit_message>
Part I docx: full current version incl. visual-page texts
Co-Authored-By: Claude Sonnet 5.5 <noreply@anthropic.com>
Claude-Session: https://claude.ai/code/session_01CfL6gEHHcASoTW7F2Kmby8
</commit_message>
<xml_diff>
--- a/export/Czesc-I-Fundamenty-marki.docx
+++ b/export/Czesc-I-Fundamenty-marki.docx
@@ -16,6 +16,988 @@
       </w:pPr>
       <w:r>
         <w:t>Część I · Fundamenty marki</w:t>
+      </w:r>
+    </w:p>
+    <w:p>
+      <w:r>
+        <w:rPr>
+          <w:b w:val="0"/>
+          <w:i/>
+        </w:rPr>
+        <w:t>Wersja zgodna z obecną księgą online (strony 5–19). Kolejność jak w księdze: strona tytułowa części, plansza „Jak korzystać” (str. 6), tekst sekcji 03–13 (str. 7–18), plansza „Głos marki” (str. 19).</w:t>
+      </w:r>
+    </w:p>
+    <w:p>
+      <w:pPr>
+        <w:pStyle w:val="Heading2"/>
+      </w:pPr>
+      <w:r>
+        <w:t>Strona tytułowa części (str. 5)</w:t>
+      </w:r>
+    </w:p>
+    <w:p>
+      <w:r>
+        <w:rPr>
+          <w:b/>
+          <w:i w:val="0"/>
+        </w:rPr>
+        <w:t>Część I — Fundamenty marki</w:t>
+      </w:r>
+      <w:r>
+        <w:br/>
+      </w:r>
+      <w:r>
+        <w:rPr>
+          <w:b w:val="0"/>
+          <w:i w:val="0"/>
+        </w:rPr>
+        <w:t>Marka, jej istota, wartości, odbiorcy i osobowość.</w:t>
+      </w:r>
+    </w:p>
+    <w:tbl>
+      <w:tblPr>
+        <w:tblStyle w:val="TableGrid"/>
+        <w:tblW w:type="auto" w:w="0"/>
+        <w:tblLook w:firstColumn="1" w:firstRow="1" w:lastColumn="0" w:lastRow="0" w:noHBand="0" w:noVBand="1" w:val="04A0"/>
+      </w:tblPr>
+      <w:tblGrid>
+        <w:gridCol w:w="4320"/>
+        <w:gridCol w:w="4320"/>
+      </w:tblGrid>
+      <w:tr>
+        <w:tc>
+          <w:tcPr>
+            <w:tcW w:type="dxa" w:w="4320"/>
+            <w:shd w:val="clear" w:fill="EDE9D0"/>
+          </w:tcPr>
+          <w:p>
+            <w:r>
+              <w:rPr>
+                <w:b/>
+                <w:i w:val="0"/>
+                <w:sz w:val="18"/>
+              </w:rPr>
+              <w:t>Nr</w:t>
+            </w:r>
+          </w:p>
+        </w:tc>
+        <w:tc>
+          <w:tcPr>
+            <w:tcW w:type="dxa" w:w="4320"/>
+            <w:shd w:val="clear" w:fill="EDE9D0"/>
+          </w:tcPr>
+          <w:p>
+            <w:r>
+              <w:rPr>
+                <w:b/>
+                <w:i w:val="0"/>
+                <w:sz w:val="18"/>
+              </w:rPr>
+              <w:t>Sekcja</w:t>
+            </w:r>
+          </w:p>
+        </w:tc>
+      </w:tr>
+      <w:tr>
+        <w:tc>
+          <w:tcPr>
+            <w:tcW w:type="dxa" w:w="4320"/>
+          </w:tcPr>
+          <w:p>
+            <w:r>
+              <w:rPr>
+                <w:b w:val="0"/>
+                <w:i w:val="0"/>
+                <w:sz w:val="18"/>
+              </w:rPr>
+              <w:t>03</w:t>
+            </w:r>
+          </w:p>
+        </w:tc>
+        <w:tc>
+          <w:tcPr>
+            <w:tcW w:type="dxa" w:w="4320"/>
+          </w:tcPr>
+          <w:p>
+            <w:r>
+              <w:rPr>
+                <w:b w:val="0"/>
+                <w:i w:val="0"/>
+                <w:sz w:val="18"/>
+              </w:rPr>
+              <w:t>Jak korzystać z Brand Booka</w:t>
+            </w:r>
+          </w:p>
+        </w:tc>
+      </w:tr>
+      <w:tr>
+        <w:tc>
+          <w:tcPr>
+            <w:tcW w:type="dxa" w:w="4320"/>
+          </w:tcPr>
+          <w:p>
+            <w:r>
+              <w:rPr>
+                <w:b w:val="0"/>
+                <w:i w:val="0"/>
+                <w:sz w:val="18"/>
+              </w:rPr>
+              <w:t>04</w:t>
+            </w:r>
+          </w:p>
+        </w:tc>
+        <w:tc>
+          <w:tcPr>
+            <w:tcW w:type="dxa" w:w="4320"/>
+          </w:tcPr>
+          <w:p>
+            <w:r>
+              <w:rPr>
+                <w:b w:val="0"/>
+                <w:i w:val="0"/>
+                <w:sz w:val="18"/>
+              </w:rPr>
+              <w:t>Marka w skrócie</w:t>
+            </w:r>
+          </w:p>
+        </w:tc>
+      </w:tr>
+      <w:tr>
+        <w:tc>
+          <w:tcPr>
+            <w:tcW w:type="dxa" w:w="4320"/>
+          </w:tcPr>
+          <w:p>
+            <w:r>
+              <w:rPr>
+                <w:b w:val="0"/>
+                <w:i w:val="0"/>
+                <w:sz w:val="18"/>
+              </w:rPr>
+              <w:t>05</w:t>
+            </w:r>
+          </w:p>
+        </w:tc>
+        <w:tc>
+          <w:tcPr>
+            <w:tcW w:type="dxa" w:w="4320"/>
+          </w:tcPr>
+          <w:p>
+            <w:r>
+              <w:rPr>
+                <w:b w:val="0"/>
+                <w:i w:val="0"/>
+                <w:sz w:val="18"/>
+              </w:rPr>
+              <w:t>O marce</w:t>
+            </w:r>
+          </w:p>
+        </w:tc>
+      </w:tr>
+      <w:tr>
+        <w:tc>
+          <w:tcPr>
+            <w:tcW w:type="dxa" w:w="4320"/>
+          </w:tcPr>
+          <w:p>
+            <w:r>
+              <w:rPr>
+                <w:b w:val="0"/>
+                <w:i w:val="0"/>
+                <w:sz w:val="18"/>
+              </w:rPr>
+              <w:t>06</w:t>
+            </w:r>
+          </w:p>
+        </w:tc>
+        <w:tc>
+          <w:tcPr>
+            <w:tcW w:type="dxa" w:w="4320"/>
+          </w:tcPr>
+          <w:p>
+            <w:r>
+              <w:rPr>
+                <w:b w:val="0"/>
+                <w:i w:val="0"/>
+                <w:sz w:val="18"/>
+              </w:rPr>
+              <w:t>Brand Essence / DNA marki</w:t>
+            </w:r>
+          </w:p>
+        </w:tc>
+      </w:tr>
+      <w:tr>
+        <w:tc>
+          <w:tcPr>
+            <w:tcW w:type="dxa" w:w="4320"/>
+          </w:tcPr>
+          <w:p>
+            <w:r>
+              <w:rPr>
+                <w:b w:val="0"/>
+                <w:i w:val="0"/>
+                <w:sz w:val="18"/>
+              </w:rPr>
+              <w:t>07</w:t>
+            </w:r>
+          </w:p>
+        </w:tc>
+        <w:tc>
+          <w:tcPr>
+            <w:tcW w:type="dxa" w:w="4320"/>
+          </w:tcPr>
+          <w:p>
+            <w:r>
+              <w:rPr>
+                <w:b w:val="0"/>
+                <w:i w:val="0"/>
+                <w:sz w:val="18"/>
+              </w:rPr>
+              <w:t>Misja</w:t>
+            </w:r>
+          </w:p>
+        </w:tc>
+      </w:tr>
+      <w:tr>
+        <w:tc>
+          <w:tcPr>
+            <w:tcW w:type="dxa" w:w="4320"/>
+          </w:tcPr>
+          <w:p>
+            <w:r>
+              <w:rPr>
+                <w:b w:val="0"/>
+                <w:i w:val="0"/>
+                <w:sz w:val="18"/>
+              </w:rPr>
+              <w:t>08</w:t>
+            </w:r>
+          </w:p>
+        </w:tc>
+        <w:tc>
+          <w:tcPr>
+            <w:tcW w:type="dxa" w:w="4320"/>
+          </w:tcPr>
+          <w:p>
+            <w:r>
+              <w:rPr>
+                <w:b w:val="0"/>
+                <w:i w:val="0"/>
+                <w:sz w:val="18"/>
+              </w:rPr>
+              <w:t>Wizja</w:t>
+            </w:r>
+          </w:p>
+        </w:tc>
+      </w:tr>
+      <w:tr>
+        <w:tc>
+          <w:tcPr>
+            <w:tcW w:type="dxa" w:w="4320"/>
+          </w:tcPr>
+          <w:p>
+            <w:r>
+              <w:rPr>
+                <w:b w:val="0"/>
+                <w:i w:val="0"/>
+                <w:sz w:val="18"/>
+              </w:rPr>
+              <w:t>09</w:t>
+            </w:r>
+          </w:p>
+        </w:tc>
+        <w:tc>
+          <w:tcPr>
+            <w:tcW w:type="dxa" w:w="4320"/>
+          </w:tcPr>
+          <w:p>
+            <w:r>
+              <w:rPr>
+                <w:b w:val="0"/>
+                <w:i w:val="0"/>
+                <w:sz w:val="18"/>
+              </w:rPr>
+              <w:t>Wartości marki</w:t>
+            </w:r>
+          </w:p>
+        </w:tc>
+      </w:tr>
+      <w:tr>
+        <w:tc>
+          <w:tcPr>
+            <w:tcW w:type="dxa" w:w="4320"/>
+          </w:tcPr>
+          <w:p>
+            <w:r>
+              <w:rPr>
+                <w:b w:val="0"/>
+                <w:i w:val="0"/>
+                <w:sz w:val="18"/>
+              </w:rPr>
+              <w:t>10</w:t>
+            </w:r>
+          </w:p>
+        </w:tc>
+        <w:tc>
+          <w:tcPr>
+            <w:tcW w:type="dxa" w:w="4320"/>
+          </w:tcPr>
+          <w:p>
+            <w:r>
+              <w:rPr>
+                <w:b w:val="0"/>
+                <w:i w:val="0"/>
+                <w:sz w:val="18"/>
+              </w:rPr>
+              <w:t>Pozycjonowanie marki</w:t>
+            </w:r>
+          </w:p>
+        </w:tc>
+      </w:tr>
+      <w:tr>
+        <w:tc>
+          <w:tcPr>
+            <w:tcW w:type="dxa" w:w="4320"/>
+          </w:tcPr>
+          <w:p>
+            <w:r>
+              <w:rPr>
+                <w:b w:val="0"/>
+                <w:i w:val="0"/>
+                <w:sz w:val="18"/>
+              </w:rPr>
+              <w:t>11</w:t>
+            </w:r>
+          </w:p>
+        </w:tc>
+        <w:tc>
+          <w:tcPr>
+            <w:tcW w:type="dxa" w:w="4320"/>
+          </w:tcPr>
+          <w:p>
+            <w:r>
+              <w:rPr>
+                <w:b w:val="0"/>
+                <w:i w:val="0"/>
+                <w:sz w:val="18"/>
+              </w:rPr>
+              <w:t>Przewaga i Reasons to Believe</w:t>
+            </w:r>
+          </w:p>
+        </w:tc>
+      </w:tr>
+      <w:tr>
+        <w:tc>
+          <w:tcPr>
+            <w:tcW w:type="dxa" w:w="4320"/>
+          </w:tcPr>
+          <w:p>
+            <w:r>
+              <w:rPr>
+                <w:b w:val="0"/>
+                <w:i w:val="0"/>
+                <w:sz w:val="18"/>
+              </w:rPr>
+              <w:t>12</w:t>
+            </w:r>
+          </w:p>
+        </w:tc>
+        <w:tc>
+          <w:tcPr>
+            <w:tcW w:type="dxa" w:w="4320"/>
+          </w:tcPr>
+          <w:p>
+            <w:r>
+              <w:rPr>
+                <w:b w:val="0"/>
+                <w:i w:val="0"/>
+                <w:sz w:val="18"/>
+              </w:rPr>
+              <w:t>Grupy docelowe</w:t>
+            </w:r>
+          </w:p>
+        </w:tc>
+      </w:tr>
+      <w:tr>
+        <w:tc>
+          <w:tcPr>
+            <w:tcW w:type="dxa" w:w="4320"/>
+          </w:tcPr>
+          <w:p>
+            <w:r>
+              <w:rPr>
+                <w:b w:val="0"/>
+                <w:i w:val="0"/>
+                <w:sz w:val="18"/>
+              </w:rPr>
+              <w:t>13</w:t>
+            </w:r>
+          </w:p>
+        </w:tc>
+        <w:tc>
+          <w:tcPr>
+            <w:tcW w:type="dxa" w:w="4320"/>
+          </w:tcPr>
+          <w:p>
+            <w:r>
+              <w:rPr>
+                <w:b w:val="0"/>
+                <w:i w:val="0"/>
+                <w:sz w:val="18"/>
+              </w:rPr>
+              <w:t>Osobowość marki</w:t>
+            </w:r>
+          </w:p>
+        </w:tc>
+      </w:tr>
+    </w:tbl>
+    <w:p/>
+    <w:p>
+      <w:pPr>
+        <w:pStyle w:val="Heading2"/>
+      </w:pPr>
+      <w:r>
+        <w:t>PLANSZA — 03 Jak korzystać z Brand Booka (str. 6)</w:t>
+      </w:r>
+    </w:p>
+    <w:p>
+      <w:r>
+        <w:rPr>
+          <w:b/>
+          <w:color w:val="ED6842"/>
+        </w:rPr>
+        <w:t>ROZWIJAMY TO, CO JUŻ DZIAŁA.</w:t>
+      </w:r>
+    </w:p>
+    <w:p>
+      <w:r>
+        <w:rPr>
+          <w:b w:val="0"/>
+          <w:i w:val="0"/>
+        </w:rPr>
+        <w:t>Ten Brand Book nie tworzy marki od początku. Zachowuje elementy, które działają, porządkuje te, które wymagają konsekwencji, i poprawia te, które osłabiają czytelność lub wiarygodność. Księga Znaku ma pierwszeństwo w sprawach samego logo.</w:t>
+      </w:r>
+    </w:p>
+    <w:tbl>
+      <w:tblPr>
+        <w:tblStyle w:val="TableGrid"/>
+        <w:tblW w:type="auto" w:w="0"/>
+        <w:tblLook w:firstColumn="1" w:firstRow="1" w:lastColumn="0" w:lastRow="0" w:noHBand="0" w:noVBand="1" w:val="04A0"/>
+      </w:tblPr>
+      <w:tblGrid>
+        <w:gridCol w:w="4320"/>
+        <w:gridCol w:w="4320"/>
+      </w:tblGrid>
+      <w:tr>
+        <w:tc>
+          <w:tcPr>
+            <w:tcW w:type="dxa" w:w="4320"/>
+          </w:tcPr>
+          <w:p>
+            <w:r>
+              <w:rPr>
+                <w:b w:val="0"/>
+                <w:i w:val="0"/>
+                <w:sz w:val="18"/>
+              </w:rPr>
+              <w:t>Obowiązkowe</w:t>
+            </w:r>
+          </w:p>
+        </w:tc>
+        <w:tc>
+          <w:tcPr>
+            <w:tcW w:type="dxa" w:w="4320"/>
+          </w:tcPr>
+          <w:p>
+            <w:r>
+              <w:rPr>
+                <w:b w:val="0"/>
+                <w:i w:val="0"/>
+                <w:sz w:val="18"/>
+              </w:rPr>
+              <w:t>Logo i jego wersje, paleta, zasada „materiał przed dekoracją”, naturalny kolor cegły na zdjęciach.</w:t>
+            </w:r>
+          </w:p>
+        </w:tc>
+      </w:tr>
+      <w:tr>
+        <w:tc>
+          <w:tcPr>
+            <w:tcW w:type="dxa" w:w="4320"/>
+          </w:tcPr>
+          <w:p>
+            <w:r>
+              <w:rPr>
+                <w:b w:val="0"/>
+                <w:i w:val="0"/>
+                <w:sz w:val="18"/>
+              </w:rPr>
+              <w:t>Elastyczne</w:t>
+            </w:r>
+          </w:p>
+        </w:tc>
+        <w:tc>
+          <w:tcPr>
+            <w:tcW w:type="dxa" w:w="4320"/>
+          </w:tcPr>
+          <w:p>
+            <w:r>
+              <w:rPr>
+                <w:b w:val="0"/>
+                <w:i w:val="0"/>
+                <w:sz w:val="18"/>
+              </w:rPr>
+              <w:t>Układy, proporcje, format, wybór wariantu CTA. Odstępstwa zatwierdza [osoba odpowiedzialna za markę].</w:t>
+            </w:r>
+          </w:p>
+        </w:tc>
+      </w:tr>
+    </w:tbl>
+    <w:p/>
+    <w:tbl>
+      <w:tblPr>
+        <w:tblStyle w:val="TableGrid"/>
+        <w:tblW w:type="auto" w:w="0"/>
+        <w:tblLook w:firstColumn="1" w:firstRow="1" w:lastColumn="0" w:lastRow="0" w:noHBand="0" w:noVBand="1" w:val="04A0"/>
+      </w:tblPr>
+      <w:tblGrid>
+        <w:gridCol w:w="2880"/>
+        <w:gridCol w:w="2880"/>
+        <w:gridCol w:w="2880"/>
+      </w:tblGrid>
+      <w:tr>
+        <w:tc>
+          <w:tcPr>
+            <w:tcW w:type="dxa" w:w="2880"/>
+            <w:shd w:val="clear" w:fill="EDE9D0"/>
+          </w:tcPr>
+          <w:p>
+            <w:r>
+              <w:rPr>
+                <w:b/>
+                <w:i w:val="0"/>
+                <w:sz w:val="18"/>
+              </w:rPr>
+              <w:t>Zachować</w:t>
+            </w:r>
+          </w:p>
+        </w:tc>
+        <w:tc>
+          <w:tcPr>
+            <w:tcW w:type="dxa" w:w="2880"/>
+            <w:shd w:val="clear" w:fill="EDE9D0"/>
+          </w:tcPr>
+          <w:p>
+            <w:r>
+              <w:rPr>
+                <w:b/>
+                <w:i w:val="0"/>
+                <w:sz w:val="18"/>
+              </w:rPr>
+              <w:t>Uporządkować</w:t>
+            </w:r>
+          </w:p>
+        </w:tc>
+        <w:tc>
+          <w:tcPr>
+            <w:tcW w:type="dxa" w:w="2880"/>
+            <w:shd w:val="clear" w:fill="EDE9D0"/>
+          </w:tcPr>
+          <w:p>
+            <w:r>
+              <w:rPr>
+                <w:b/>
+                <w:i w:val="0"/>
+                <w:sz w:val="18"/>
+              </w:rPr>
+              <w:t>Poprawić</w:t>
+            </w:r>
+          </w:p>
+        </w:tc>
+      </w:tr>
+      <w:tr>
+        <w:tc>
+          <w:tcPr>
+            <w:tcW w:type="dxa" w:w="2880"/>
+          </w:tcPr>
+          <w:p>
+            <w:r>
+              <w:rPr>
+                <w:b w:val="0"/>
+                <w:i w:val="0"/>
+                <w:sz w:val="18"/>
+              </w:rPr>
+              <w:t>Logo i jego fonty</w:t>
+            </w:r>
+          </w:p>
+        </w:tc>
+        <w:tc>
+          <w:tcPr>
+            <w:tcW w:type="dxa" w:w="2880"/>
+          </w:tcPr>
+          <w:p>
+            <w:r>
+              <w:rPr>
+                <w:b w:val="0"/>
+                <w:i w:val="0"/>
+                <w:sz w:val="18"/>
+              </w:rPr>
+              <w:t>Proporcje użycia kolorów</w:t>
+            </w:r>
+          </w:p>
+        </w:tc>
+        <w:tc>
+          <w:tcPr>
+            <w:tcW w:type="dxa" w:w="2880"/>
+          </w:tcPr>
+          <w:p>
+            <w:r>
+              <w:rPr>
+                <w:b w:val="0"/>
+                <w:i w:val="0"/>
+                <w:sz w:val="18"/>
+              </w:rPr>
+              <w:t>Logo zasłaniające produkt</w:t>
+            </w:r>
+          </w:p>
+        </w:tc>
+      </w:tr>
+      <w:tr>
+        <w:tc>
+          <w:tcPr>
+            <w:tcW w:type="dxa" w:w="2880"/>
+          </w:tcPr>
+          <w:p>
+            <w:r>
+              <w:rPr>
+                <w:b w:val="0"/>
+                <w:i w:val="0"/>
+                <w:sz w:val="18"/>
+              </w:rPr>
+              <w:t>Paleta z Księgi Znaku</w:t>
+            </w:r>
+          </w:p>
+        </w:tc>
+        <w:tc>
+          <w:tcPr>
+            <w:tcW w:type="dxa" w:w="2880"/>
+          </w:tcPr>
+          <w:p>
+            <w:r>
+              <w:rPr>
+                <w:b w:val="0"/>
+                <w:i w:val="0"/>
+                <w:sz w:val="18"/>
+              </w:rPr>
+              <w:t>Hierarchia typografii</w:t>
+            </w:r>
+          </w:p>
+        </w:tc>
+        <w:tc>
+          <w:tcPr>
+            <w:tcW w:type="dxa" w:w="2880"/>
+          </w:tcPr>
+          <w:p>
+            <w:r>
+              <w:rPr>
+                <w:b w:val="0"/>
+                <w:i w:val="0"/>
+                <w:sz w:val="18"/>
+              </w:rPr>
+              <w:t>Kilka mocnych kolorów w grafice</w:t>
+            </w:r>
+          </w:p>
+        </w:tc>
+      </w:tr>
+      <w:tr>
+        <w:tc>
+          <w:tcPr>
+            <w:tcW w:type="dxa" w:w="2880"/>
+          </w:tcPr>
+          <w:p>
+            <w:r>
+              <w:rPr>
+                <w:b w:val="0"/>
+                <w:i w:val="0"/>
+                <w:sz w:val="18"/>
+              </w:rPr>
+              <w:t>Pomarańcz jako akcent</w:t>
+            </w:r>
+          </w:p>
+        </w:tc>
+        <w:tc>
+          <w:tcPr>
+            <w:tcW w:type="dxa" w:w="2880"/>
+          </w:tcPr>
+          <w:p>
+            <w:r>
+              <w:rPr>
+                <w:b w:val="0"/>
+                <w:i w:val="0"/>
+                <w:sz w:val="18"/>
+              </w:rPr>
+              <w:t>Siedem szablonów social</w:t>
+            </w:r>
+          </w:p>
+        </w:tc>
+        <w:tc>
+          <w:tcPr>
+            <w:tcW w:type="dxa" w:w="2880"/>
+          </w:tcPr>
+          <w:p>
+            <w:r>
+              <w:rPr>
+                <w:b w:val="0"/>
+                <w:i w:val="0"/>
+                <w:sz w:val="18"/>
+              </w:rPr>
+              <w:t>Filtry zmieniające kolor cegły</w:t>
+            </w:r>
+          </w:p>
+        </w:tc>
+      </w:tr>
+      <w:tr>
+        <w:tc>
+          <w:tcPr>
+            <w:tcW w:type="dxa" w:w="2880"/>
+          </w:tcPr>
+          <w:p>
+            <w:r>
+              <w:rPr>
+                <w:b w:val="0"/>
+                <w:i w:val="0"/>
+                <w:sz w:val="18"/>
+              </w:rPr>
+              <w:t>Realizacje jako dowód</w:t>
+            </w:r>
+          </w:p>
+        </w:tc>
+        <w:tc>
+          <w:tcPr>
+            <w:tcW w:type="dxa" w:w="2880"/>
+          </w:tcPr>
+          <w:p>
+            <w:r>
+              <w:rPr>
+                <w:b w:val="0"/>
+                <w:i w:val="0"/>
+                <w:sz w:val="18"/>
+              </w:rPr>
+              <w:t>Podpis źródła pod zdjęciem</w:t>
+            </w:r>
+          </w:p>
+        </w:tc>
+        <w:tc>
+          <w:tcPr>
+            <w:tcW w:type="dxa" w:w="2880"/>
+          </w:tcPr>
+          <w:p>
+            <w:r>
+              <w:rPr>
+                <w:b w:val="0"/>
+                <w:i w:val="0"/>
+                <w:sz w:val="18"/>
+              </w:rPr>
+              <w:t>Drobny tekst na zdjęciu</w:t>
+            </w:r>
+          </w:p>
+        </w:tc>
+      </w:tr>
+      <w:tr>
+        <w:tc>
+          <w:tcPr>
+            <w:tcW w:type="dxa" w:w="2880"/>
+          </w:tcPr>
+          <w:p>
+            <w:r>
+              <w:rPr>
+                <w:b w:val="0"/>
+                <w:i w:val="0"/>
+                <w:sz w:val="18"/>
+              </w:rPr>
+              <w:t>Próbka jako narzędzie decyzji</w:t>
+            </w:r>
+          </w:p>
+        </w:tc>
+        <w:tc>
+          <w:tcPr>
+            <w:tcW w:type="dxa" w:w="2880"/>
+          </w:tcPr>
+          <w:p>
+            <w:r>
+              <w:rPr>
+                <w:b w:val="0"/>
+                <w:i w:val="0"/>
+                <w:sz w:val="18"/>
+              </w:rPr>
+              <w:t>Jedno CTA na komunikat</w:t>
+            </w:r>
+          </w:p>
+        </w:tc>
+        <w:tc>
+          <w:tcPr>
+            <w:tcW w:type="dxa" w:w="2880"/>
+          </w:tcPr>
+          <w:p>
+            <w:r>
+              <w:rPr>
+                <w:b w:val="0"/>
+                <w:i w:val="0"/>
+                <w:sz w:val="18"/>
+              </w:rPr>
+              <w:t>Kilka CTA i numerów w jednym poście</w:t>
+            </w:r>
+          </w:p>
+        </w:tc>
+      </w:tr>
+    </w:tbl>
+    <w:p/>
+    <w:tbl>
+      <w:tblPr>
+        <w:tblStyle w:val="TableGrid"/>
+        <w:tblW w:type="auto" w:w="0"/>
+        <w:tblLook w:firstColumn="1" w:firstRow="1" w:lastColumn="0" w:lastRow="0" w:noHBand="0" w:noVBand="1" w:val="04A0"/>
+      </w:tblPr>
+      <w:tblGrid>
+        <w:gridCol w:w="4320"/>
+        <w:gridCol w:w="4320"/>
+      </w:tblGrid>
+      <w:tr>
+        <w:tc>
+          <w:tcPr>
+            <w:tcW w:type="dxa" w:w="4320"/>
+          </w:tcPr>
+          <w:p>
+            <w:r>
+              <w:rPr>
+                <w:b w:val="0"/>
+                <w:i w:val="0"/>
+                <w:sz w:val="18"/>
+              </w:rPr>
+              <w:t>Co</w:t>
+            </w:r>
+          </w:p>
+        </w:tc>
+        <w:tc>
+          <w:tcPr>
+            <w:tcW w:type="dxa" w:w="4320"/>
+          </w:tcPr>
+          <w:p>
+            <w:r>
+              <w:rPr>
+                <w:b w:val="0"/>
+                <w:i w:val="0"/>
+                <w:sz w:val="18"/>
+              </w:rPr>
+              <w:t>Trzy kategorie zaleceń: zachować, uporządkować, poprawić.</w:t>
+            </w:r>
+          </w:p>
+        </w:tc>
+      </w:tr>
+      <w:tr>
+        <w:tc>
+          <w:tcPr>
+            <w:tcW w:type="dxa" w:w="4320"/>
+          </w:tcPr>
+          <w:p>
+            <w:r>
+              <w:rPr>
+                <w:b w:val="0"/>
+                <w:i w:val="0"/>
+                <w:sz w:val="18"/>
+              </w:rPr>
+              <w:t>Dlaczego</w:t>
+            </w:r>
+          </w:p>
+        </w:tc>
+        <w:tc>
+          <w:tcPr>
+            <w:tcW w:type="dxa" w:w="4320"/>
+          </w:tcPr>
+          <w:p>
+            <w:r>
+              <w:rPr>
+                <w:b w:val="0"/>
+                <w:i w:val="0"/>
+                <w:sz w:val="18"/>
+              </w:rPr>
+              <w:t>Zmiana nie jest celem. Każda rekomendacja ma wynikać z realnych materiałów marki lub jasnej potrzeby.</w:t>
+            </w:r>
+          </w:p>
+        </w:tc>
+      </w:tr>
+      <w:tr>
+        <w:tc>
+          <w:tcPr>
+            <w:tcW w:type="dxa" w:w="4320"/>
+          </w:tcPr>
+          <w:p>
+            <w:r>
+              <w:rPr>
+                <w:b w:val="0"/>
+                <w:i w:val="0"/>
+                <w:sz w:val="18"/>
+              </w:rPr>
+              <w:t>Jak stosować</w:t>
+            </w:r>
+          </w:p>
+        </w:tc>
+        <w:tc>
+          <w:tcPr>
+            <w:tcW w:type="dxa" w:w="4320"/>
+          </w:tcPr>
+          <w:p>
+            <w:r>
+              <w:rPr>
+                <w:b w:val="0"/>
+                <w:i w:val="0"/>
+                <w:sz w:val="18"/>
+              </w:rPr>
+              <w:t>Przy nowym materiale sprawdź, do której kategorii należy decyzja, i zacznij od istniejącego szablonu.</w:t>
+            </w:r>
+          </w:p>
+        </w:tc>
+      </w:tr>
+      <w:tr>
+        <w:tc>
+          <w:tcPr>
+            <w:tcW w:type="dxa" w:w="4320"/>
+          </w:tcPr>
+          <w:p>
+            <w:r>
+              <w:rPr>
+                <w:b w:val="0"/>
+                <w:i w:val="0"/>
+                <w:sz w:val="18"/>
+              </w:rPr>
+              <w:t>Czego unikać</w:t>
+            </w:r>
+          </w:p>
+        </w:tc>
+        <w:tc>
+          <w:tcPr>
+            <w:tcW w:type="dxa" w:w="4320"/>
+          </w:tcPr>
+          <w:p>
+            <w:r>
+              <w:rPr>
+                <w:b w:val="0"/>
+                <w:i w:val="0"/>
+                <w:sz w:val="18"/>
+              </w:rPr>
+              <w:t>Dodawania nowych elementów graficznych bez powodu i traktowania propozycji jako zmiany tożsamości.</w:t>
+            </w:r>
+          </w:p>
+        </w:tc>
+      </w:tr>
+    </w:tbl>
+    <w:p/>
+    <w:p>
+      <w:pPr>
+        <w:pStyle w:val="Heading2"/>
+      </w:pPr>
+      <w:r>
+        <w:t>TEKST — sekcje 03–13 (str. 7–18)</w:t>
       </w:r>
     </w:p>
     <w:p>
@@ -4484,6 +5466,653 @@
         <w:t>charakterystyczna</w:t>
       </w:r>
     </w:p>
+    <w:p>
+      <w:pPr>
+        <w:pStyle w:val="Heading2"/>
+      </w:pPr>
+      <w:r>
+        <w:t>PLANSZA — 13 Osobowość marki · Głos marki (str. 19)</w:t>
+      </w:r>
+    </w:p>
+    <w:p>
+      <w:r>
+        <w:rPr>
+          <w:b/>
+          <w:color w:val="ED6842"/>
+        </w:rPr>
+        <w:t>GŁÓWNE PRZESŁANIE</w:t>
+      </w:r>
+    </w:p>
+    <w:p>
+      <w:r>
+        <w:rPr>
+          <w:b/>
+          <w:i w:val="0"/>
+        </w:rPr>
+        <w:t>To nie jest imitacja. To prawdziwa historia.</w:t>
+      </w:r>
+    </w:p>
+    <w:p>
+      <w:r>
+        <w:rPr>
+          <w:b w:val="0"/>
+          <w:i w:val="0"/>
+        </w:rPr>
+        <w:t>Klient dostaje fragment rzeczywistego, starego materiału, a nie produkt, który tylko próbuje go naśladować. W tekście to samo co na zdjęciu: konkret zamiast przymiotników.</w:t>
+      </w:r>
+    </w:p>
+    <w:p>
+      <w:r>
+        <w:rPr>
+          <w:b/>
+          <w:color w:val="ED6842"/>
+        </w:rPr>
+        <w:t>OSOBOWOŚĆ MARKI (SKALE)</w:t>
+      </w:r>
+    </w:p>
+    <w:tbl>
+      <w:tblPr>
+        <w:tblStyle w:val="TableGrid"/>
+        <w:tblW w:type="auto" w:w="0"/>
+        <w:tblLook w:firstColumn="1" w:firstRow="1" w:lastColumn="0" w:lastRow="0" w:noHBand="0" w:noVBand="1" w:val="04A0"/>
+      </w:tblPr>
+      <w:tblGrid>
+        <w:gridCol w:w="2880"/>
+        <w:gridCol w:w="2880"/>
+        <w:gridCol w:w="2880"/>
+      </w:tblGrid>
+      <w:tr>
+        <w:tc>
+          <w:tcPr>
+            <w:tcW w:type="dxa" w:w="2880"/>
+            <w:shd w:val="clear" w:fill="EDE9D0"/>
+          </w:tcPr>
+          <w:p>
+            <w:r>
+              <w:rPr>
+                <w:b/>
+                <w:i w:val="0"/>
+                <w:sz w:val="18"/>
+              </w:rPr>
+              <w:t>Biegun lewy</w:t>
+            </w:r>
+          </w:p>
+        </w:tc>
+        <w:tc>
+          <w:tcPr>
+            <w:tcW w:type="dxa" w:w="2880"/>
+            <w:shd w:val="clear" w:fill="EDE9D0"/>
+          </w:tcPr>
+          <w:p>
+            <w:r>
+              <w:rPr>
+                <w:b/>
+                <w:i w:val="0"/>
+                <w:sz w:val="18"/>
+              </w:rPr>
+              <w:t>Pozycja na skali (od lewej)</w:t>
+            </w:r>
+          </w:p>
+        </w:tc>
+        <w:tc>
+          <w:tcPr>
+            <w:tcW w:type="dxa" w:w="2880"/>
+            <w:shd w:val="clear" w:fill="EDE9D0"/>
+          </w:tcPr>
+          <w:p>
+            <w:r>
+              <w:rPr>
+                <w:b/>
+                <w:i w:val="0"/>
+                <w:sz w:val="18"/>
+              </w:rPr>
+              <w:t>Biegun prawy</w:t>
+            </w:r>
+          </w:p>
+        </w:tc>
+      </w:tr>
+      <w:tr>
+        <w:tc>
+          <w:tcPr>
+            <w:tcW w:type="dxa" w:w="2880"/>
+          </w:tcPr>
+          <w:p>
+            <w:r>
+              <w:rPr>
+                <w:b w:val="0"/>
+                <w:i w:val="0"/>
+                <w:sz w:val="18"/>
+              </w:rPr>
+              <w:t>Ekspercka</w:t>
+            </w:r>
+          </w:p>
+        </w:tc>
+        <w:tc>
+          <w:tcPr>
+            <w:tcW w:type="dxa" w:w="2880"/>
+          </w:tcPr>
+          <w:p>
+            <w:r>
+              <w:rPr>
+                <w:b w:val="0"/>
+                <w:i w:val="0"/>
+                <w:sz w:val="18"/>
+              </w:rPr>
+              <w:t>65%</w:t>
+            </w:r>
+          </w:p>
+        </w:tc>
+        <w:tc>
+          <w:tcPr>
+            <w:tcW w:type="dxa" w:w="2880"/>
+          </w:tcPr>
+          <w:p>
+            <w:r>
+              <w:rPr>
+                <w:b w:val="0"/>
+                <w:i w:val="0"/>
+                <w:sz w:val="18"/>
+              </w:rPr>
+              <w:t>Dostępna</w:t>
+            </w:r>
+          </w:p>
+        </w:tc>
+      </w:tr>
+      <w:tr>
+        <w:tc>
+          <w:tcPr>
+            <w:tcW w:type="dxa" w:w="2880"/>
+          </w:tcPr>
+          <w:p>
+            <w:r>
+              <w:rPr>
+                <w:b w:val="0"/>
+                <w:i w:val="0"/>
+                <w:sz w:val="18"/>
+              </w:rPr>
+              <w:t>Formalna</w:t>
+            </w:r>
+          </w:p>
+        </w:tc>
+        <w:tc>
+          <w:tcPr>
+            <w:tcW w:type="dxa" w:w="2880"/>
+          </w:tcPr>
+          <w:p>
+            <w:r>
+              <w:rPr>
+                <w:b w:val="0"/>
+                <w:i w:val="0"/>
+                <w:sz w:val="18"/>
+              </w:rPr>
+              <w:t>35%</w:t>
+            </w:r>
+          </w:p>
+        </w:tc>
+        <w:tc>
+          <w:tcPr>
+            <w:tcW w:type="dxa" w:w="2880"/>
+          </w:tcPr>
+          <w:p>
+            <w:r>
+              <w:rPr>
+                <w:b w:val="0"/>
+                <w:i w:val="0"/>
+                <w:sz w:val="18"/>
+              </w:rPr>
+              <w:t>Swobodna</w:t>
+            </w:r>
+          </w:p>
+        </w:tc>
+      </w:tr>
+      <w:tr>
+        <w:tc>
+          <w:tcPr>
+            <w:tcW w:type="dxa" w:w="2880"/>
+          </w:tcPr>
+          <w:p>
+            <w:r>
+              <w:rPr>
+                <w:b w:val="0"/>
+                <w:i w:val="0"/>
+                <w:sz w:val="18"/>
+              </w:rPr>
+              <w:t>Spokojna</w:t>
+            </w:r>
+          </w:p>
+        </w:tc>
+        <w:tc>
+          <w:tcPr>
+            <w:tcW w:type="dxa" w:w="2880"/>
+          </w:tcPr>
+          <w:p>
+            <w:r>
+              <w:rPr>
+                <w:b w:val="0"/>
+                <w:i w:val="0"/>
+                <w:sz w:val="18"/>
+              </w:rPr>
+              <w:t>75%</w:t>
+            </w:r>
+          </w:p>
+        </w:tc>
+        <w:tc>
+          <w:tcPr>
+            <w:tcW w:type="dxa" w:w="2880"/>
+          </w:tcPr>
+          <w:p>
+            <w:r>
+              <w:rPr>
+                <w:b w:val="0"/>
+                <w:i w:val="0"/>
+                <w:sz w:val="18"/>
+              </w:rPr>
+              <w:t>Dynamiczna</w:t>
+            </w:r>
+          </w:p>
+        </w:tc>
+      </w:tr>
+      <w:tr>
+        <w:tc>
+          <w:tcPr>
+            <w:tcW w:type="dxa" w:w="2880"/>
+          </w:tcPr>
+          <w:p>
+            <w:r>
+              <w:rPr>
+                <w:b w:val="0"/>
+                <w:i w:val="0"/>
+                <w:sz w:val="18"/>
+              </w:rPr>
+              <w:t>Tradycyjna</w:t>
+            </w:r>
+          </w:p>
+        </w:tc>
+        <w:tc>
+          <w:tcPr>
+            <w:tcW w:type="dxa" w:w="2880"/>
+          </w:tcPr>
+          <w:p>
+            <w:r>
+              <w:rPr>
+                <w:b w:val="0"/>
+                <w:i w:val="0"/>
+                <w:sz w:val="18"/>
+              </w:rPr>
+              <w:t>45%</w:t>
+            </w:r>
+          </w:p>
+        </w:tc>
+        <w:tc>
+          <w:tcPr>
+            <w:tcW w:type="dxa" w:w="2880"/>
+          </w:tcPr>
+          <w:p>
+            <w:r>
+              <w:rPr>
+                <w:b w:val="0"/>
+                <w:i w:val="0"/>
+                <w:sz w:val="18"/>
+              </w:rPr>
+              <w:t>Progresywna</w:t>
+            </w:r>
+          </w:p>
+        </w:tc>
+      </w:tr>
+      <w:tr>
+        <w:tc>
+          <w:tcPr>
+            <w:tcW w:type="dxa" w:w="2880"/>
+          </w:tcPr>
+          <w:p>
+            <w:r>
+              <w:rPr>
+                <w:b w:val="0"/>
+                <w:i w:val="0"/>
+                <w:sz w:val="18"/>
+              </w:rPr>
+              <w:t>Premium</w:t>
+            </w:r>
+          </w:p>
+        </w:tc>
+        <w:tc>
+          <w:tcPr>
+            <w:tcW w:type="dxa" w:w="2880"/>
+          </w:tcPr>
+          <w:p>
+            <w:r>
+              <w:rPr>
+                <w:b w:val="0"/>
+                <w:i w:val="0"/>
+                <w:sz w:val="18"/>
+              </w:rPr>
+              <w:t>65%</w:t>
+            </w:r>
+          </w:p>
+        </w:tc>
+        <w:tc>
+          <w:tcPr>
+            <w:tcW w:type="dxa" w:w="2880"/>
+          </w:tcPr>
+          <w:p>
+            <w:r>
+              <w:rPr>
+                <w:b w:val="0"/>
+                <w:i w:val="0"/>
+                <w:sz w:val="18"/>
+              </w:rPr>
+              <w:t>Masowa</w:t>
+            </w:r>
+          </w:p>
+        </w:tc>
+      </w:tr>
+    </w:tbl>
+    <w:p/>
+    <w:p>
+      <w:r>
+        <w:rPr>
+          <w:b/>
+          <w:color w:val="ED6842"/>
+        </w:rPr>
+        <w:t>TAK I NIE</w:t>
+      </w:r>
+    </w:p>
+    <w:tbl>
+      <w:tblPr>
+        <w:tblStyle w:val="TableGrid"/>
+        <w:tblW w:type="auto" w:w="0"/>
+        <w:tblLook w:firstColumn="1" w:firstRow="1" w:lastColumn="0" w:lastRow="0" w:noHBand="0" w:noVBand="1" w:val="04A0"/>
+      </w:tblPr>
+      <w:tblGrid>
+        <w:gridCol w:w="4320"/>
+        <w:gridCol w:w="4320"/>
+      </w:tblGrid>
+      <w:tr>
+        <w:tc>
+          <w:tcPr>
+            <w:tcW w:type="dxa" w:w="4320"/>
+          </w:tcPr>
+          <w:p>
+            <w:r>
+              <w:rPr>
+                <w:b w:val="0"/>
+                <w:i w:val="0"/>
+                <w:sz w:val="18"/>
+              </w:rPr>
+              <w:t>Tak</w:t>
+            </w:r>
+          </w:p>
+        </w:tc>
+        <w:tc>
+          <w:tcPr>
+            <w:tcW w:type="dxa" w:w="4320"/>
+          </w:tcPr>
+          <w:p>
+            <w:r>
+              <w:rPr>
+                <w:b w:val="0"/>
+                <w:i w:val="0"/>
+                <w:sz w:val="18"/>
+              </w:rPr>
+              <w:t>Każda partia starej cegły jest trochę inna. I właśnie na tym polega jej charakter.</w:t>
+            </w:r>
+          </w:p>
+        </w:tc>
+      </w:tr>
+      <w:tr>
+        <w:tc>
+          <w:tcPr>
+            <w:tcW w:type="dxa" w:w="4320"/>
+          </w:tcPr>
+          <w:p>
+            <w:r>
+              <w:rPr>
+                <w:b w:val="0"/>
+                <w:i w:val="0"/>
+                <w:sz w:val="18"/>
+              </w:rPr>
+              <w:t>Nie</w:t>
+            </w:r>
+          </w:p>
+        </w:tc>
+        <w:tc>
+          <w:tcPr>
+            <w:tcW w:type="dxa" w:w="4320"/>
+          </w:tcPr>
+          <w:p>
+            <w:r>
+              <w:rPr>
+                <w:b w:val="0"/>
+                <w:i w:val="0"/>
+                <w:sz w:val="18"/>
+              </w:rPr>
+              <w:t>Ze względu na heterogeniczność strukturalną materiału możliwe są odchylenia chromatyczne.</w:t>
+            </w:r>
+          </w:p>
+        </w:tc>
+      </w:tr>
+      <w:tr>
+        <w:tc>
+          <w:tcPr>
+            <w:tcW w:type="dxa" w:w="4320"/>
+          </w:tcPr>
+          <w:p>
+            <w:r>
+              <w:rPr>
+                <w:b w:val="0"/>
+                <w:i w:val="0"/>
+                <w:sz w:val="18"/>
+              </w:rPr>
+              <w:t>Tak</w:t>
+            </w:r>
+          </w:p>
+        </w:tc>
+        <w:tc>
+          <w:tcPr>
+            <w:tcW w:type="dxa" w:w="4320"/>
+          </w:tcPr>
+          <w:p>
+            <w:r>
+              <w:rPr>
+                <w:b w:val="0"/>
+                <w:i w:val="0"/>
+                <w:sz w:val="18"/>
+              </w:rPr>
+              <w:t>Ponad 100 lat historii. Teraz może stać się częścią Twojego wnętrza.</w:t>
+            </w:r>
+          </w:p>
+        </w:tc>
+      </w:tr>
+      <w:tr>
+        <w:tc>
+          <w:tcPr>
+            <w:tcW w:type="dxa" w:w="4320"/>
+          </w:tcPr>
+          <w:p>
+            <w:r>
+              <w:rPr>
+                <w:b w:val="0"/>
+                <w:i w:val="0"/>
+                <w:sz w:val="18"/>
+              </w:rPr>
+              <w:t>Nie</w:t>
+            </w:r>
+          </w:p>
+        </w:tc>
+        <w:tc>
+          <w:tcPr>
+            <w:tcW w:type="dxa" w:w="4320"/>
+          </w:tcPr>
+          <w:p>
+            <w:r>
+              <w:rPr>
+                <w:b w:val="0"/>
+                <w:i w:val="0"/>
+                <w:sz w:val="18"/>
+              </w:rPr>
+              <w:t>KUP TERAZ! OSTATNIA SZANSA! −40%</w:t>
+            </w:r>
+          </w:p>
+        </w:tc>
+      </w:tr>
+    </w:tbl>
+    <w:p/>
+    <w:p>
+      <w:r>
+        <w:rPr>
+          <w:b/>
+          <w:i w:val="0"/>
+        </w:rPr>
+        <w:t>Pięć cech:</w:t>
+      </w:r>
+      <w:r>
+        <w:rPr>
+          <w:b w:val="0"/>
+          <w:i w:val="0"/>
+        </w:rPr>
+        <w:t xml:space="preserve"> autentyczna · kompetentna · spokojna · świadoma · charakterystyczna</w:t>
+      </w:r>
+    </w:p>
+    <w:tbl>
+      <w:tblPr>
+        <w:tblStyle w:val="TableGrid"/>
+        <w:tblW w:type="auto" w:w="0"/>
+        <w:tblLook w:firstColumn="1" w:firstRow="1" w:lastColumn="0" w:lastRow="0" w:noHBand="0" w:noVBand="1" w:val="04A0"/>
+      </w:tblPr>
+      <w:tblGrid>
+        <w:gridCol w:w="4320"/>
+        <w:gridCol w:w="4320"/>
+      </w:tblGrid>
+      <w:tr>
+        <w:tc>
+          <w:tcPr>
+            <w:tcW w:type="dxa" w:w="4320"/>
+          </w:tcPr>
+          <w:p>
+            <w:r>
+              <w:rPr>
+                <w:b w:val="0"/>
+                <w:i w:val="0"/>
+                <w:sz w:val="18"/>
+              </w:rPr>
+              <w:t>Co</w:t>
+            </w:r>
+          </w:p>
+        </w:tc>
+        <w:tc>
+          <w:tcPr>
+            <w:tcW w:type="dxa" w:w="4320"/>
+          </w:tcPr>
+          <w:p>
+            <w:r>
+              <w:rPr>
+                <w:b w:val="0"/>
+                <w:i w:val="0"/>
+                <w:sz w:val="18"/>
+              </w:rPr>
+              <w:t>Głos: ekspercki, ale dostępny. Spokojny, premium przez materiał i historię, nie przez snobizm.</w:t>
+            </w:r>
+          </w:p>
+        </w:tc>
+      </w:tr>
+      <w:tr>
+        <w:tc>
+          <w:tcPr>
+            <w:tcW w:type="dxa" w:w="4320"/>
+          </w:tcPr>
+          <w:p>
+            <w:r>
+              <w:rPr>
+                <w:b w:val="0"/>
+                <w:i w:val="0"/>
+                <w:sz w:val="18"/>
+              </w:rPr>
+              <w:t>Dlaczego</w:t>
+            </w:r>
+          </w:p>
+        </w:tc>
+        <w:tc>
+          <w:tcPr>
+            <w:tcW w:type="dxa" w:w="4320"/>
+          </w:tcPr>
+          <w:p>
+            <w:r>
+              <w:rPr>
+                <w:b w:val="0"/>
+                <w:i w:val="0"/>
+                <w:sz w:val="18"/>
+              </w:rPr>
+              <w:t>Wizualny minimalizm i ton tekstu mają mówić jednym głosem.</w:t>
+            </w:r>
+          </w:p>
+        </w:tc>
+      </w:tr>
+      <w:tr>
+        <w:tc>
+          <w:tcPr>
+            <w:tcW w:type="dxa" w:w="4320"/>
+          </w:tcPr>
+          <w:p>
+            <w:r>
+              <w:rPr>
+                <w:b w:val="0"/>
+                <w:i w:val="0"/>
+                <w:sz w:val="18"/>
+              </w:rPr>
+              <w:t>Jak stosować</w:t>
+            </w:r>
+          </w:p>
+        </w:tc>
+        <w:tc>
+          <w:tcPr>
+            <w:tcW w:type="dxa" w:w="4320"/>
+          </w:tcPr>
+          <w:p>
+            <w:r>
+              <w:rPr>
+                <w:b w:val="0"/>
+                <w:i w:val="0"/>
+                <w:sz w:val="18"/>
+              </w:rPr>
+              <w:t>Nagłówek 3–8 słów, jedna myśl, jedno CTA. Fakty zamiast przymiotników. Domyślnie bez emoji.</w:t>
+            </w:r>
+          </w:p>
+        </w:tc>
+      </w:tr>
+      <w:tr>
+        <w:tc>
+          <w:tcPr>
+            <w:tcW w:type="dxa" w:w="4320"/>
+          </w:tcPr>
+          <w:p>
+            <w:r>
+              <w:rPr>
+                <w:b w:val="0"/>
+                <w:i w:val="0"/>
+                <w:sz w:val="18"/>
+              </w:rPr>
+              <w:t>Czego unikać</w:t>
+            </w:r>
+          </w:p>
+        </w:tc>
+        <w:tc>
+          <w:tcPr>
+            <w:tcW w:type="dxa" w:w="4320"/>
+          </w:tcPr>
+          <w:p>
+            <w:r>
+              <w:rPr>
+                <w:b w:val="0"/>
+                <w:i w:val="0"/>
+                <w:sz w:val="18"/>
+              </w:rPr>
+              <w:t>Języka korporacyjnego i potocznego, wykrzykników, CAPS LOCKA, „WOW”, złota i ekskluzywności.</w:t>
+            </w:r>
+          </w:p>
+        </w:tc>
+      </w:tr>
+    </w:tbl>
+    <w:p/>
     <w:sectPr>
       <w:pgSz w:w="12240" w:h="15840"/>
       <w:pgMar w:top="1440" w:right="1800" w:bottom="1440" w:left="1800" w:header="720" w:footer="720" w:gutter="0"/>

</xml_diff>